<commit_message>
feat: ship format recovery and pixel puzzle v1179
</commit_message>
<xml_diff>
--- a/docs/maintenance/AI开发项目_项目说明文档.docx
+++ b/docs/maintenance/AI开发项目_项目说明文档.docx
@@ -11187,6 +11187,240 @@
     <w:p>
       <w:r>
         <w:t>验收边界：Windows 自动测试、静态语法和 ZIP 清单只能证明源码及包结构；Mac 编译、签名、覆盖安装、真实 iPhone、真实模型主动消息及真实外卖下单仍需分别验收。</w:t>
+      </w:r>
+    </w:p>
+    <w:p>
+      <w:pPr>
+        <w:pStyle w:val="Heading2"/>
+      </w:pPr>
+      <w:r>
+        <w:t>2026-09-05 拼豆工坊本地可玩框架</w:t>
+      </w:r>
+    </w:p>
+    <w:p>
+      <w:r>
+        <w:t>当前状态为本地预览框架，属于网页版本与私人版本共有功能。本轮没有更新正式网页版本号，没有制作私人安装包，也没有提交或推送；需由用户实际试玩并确认交互后，才能进入正式发布流程。</w:t>
+      </w:r>
+    </w:p>
+    <w:p>
+      <w:pPr>
+        <w:pStyle w:val="ListBullet"/>
+      </w:pPr>
+      <w:r>
+        <w:t>游戏大厅新增独立拼豆工坊卡片，并为微信游戏邀请增加独立邀请卡。角色同意后才能进入，沿用现有游戏邀请边界。</w:t>
+      </w:r>
+    </w:p>
+    <w:p>
+      <w:pPr>
+        <w:pStyle w:val="ListBullet"/>
+      </w:pPr>
+      <w:r>
+        <w:t>图纸支持 8 至 32 格的独立横竖尺寸、14 至 30 像素的显示大小、十二色颜色盘、擦除、拖动连续上色，以及爱心、花朵、橘猫三个试用模板。</w:t>
+      </w:r>
+    </w:p>
+    <w:p>
+      <w:pPr>
+        <w:pStyle w:val="ListBullet"/>
+      </w:pPr>
+      <w:r>
+        <w:t>锁定图纸后，用户与角色轮流各放十颗；不足十颗时以剩余目标为准。用户错色不落子，角色只能从尚未完成的目标格中选择，落子颜色直接复制锁定图纸，模型不能提供坐标绕过校验。</w:t>
+      </w:r>
+    </w:p>
+    <w:p>
+      <w:pPr>
+        <w:pStyle w:val="ListBullet"/>
+      </w:pPr>
+      <w:r>
+        <w:t>角色模型只决定优先颜色、区域和本人真实台词。兼容模型只需返回很短的 JSON，宽松解析失败时仍可由正确落子保护完成回合，但不伪造角色台词，并在回合记录中明确说明。</w:t>
+      </w:r>
+    </w:p>
+    <w:p>
+      <w:pPr>
+        <w:pStyle w:val="ListBullet"/>
+      </w:pPr>
+      <w:r>
+        <w:t>进度、当前回合、图纸、双方落子归属和最近回合记录随核心状态保存，可从游戏大厅继续；完成后可保存成品 PNG，并建立短期微信游戏承接记录。</w:t>
+      </w:r>
+    </w:p>
+    <w:p>
+      <w:pPr>
+        <w:pStyle w:val="ListBullet"/>
+      </w:pPr>
+      <w:r>
+        <w:t>本地预览已人工走通锁定图纸、用户十颗、角色十颗、第二轮接续和错色拦截。Windows 自动测试不代表真实模型、Mac 编译、签名、私人真机或线上缓存验收。</w:t>
+      </w:r>
+    </w:p>
+    <w:p>
+      <w:pPr>
+        <w:pStyle w:val="Heading2"/>
+      </w:pPr>
+      <w:r>
+        <w:t>2026-09-05 拼豆工坊框架方向修正</w:t>
+      </w:r>
+    </w:p>
+    <w:p>
+      <w:r>
+        <w:t>范围：网页与私人版本共有的本地试玩框架；仍未提升正式版本号、打包、提交或推送。</w:t>
+      </w:r>
+    </w:p>
+    <w:p>
+      <w:pPr>
+        <w:pStyle w:val="ListBullet"/>
+      </w:pPr>
+      <w:r>
+        <w:t>布局改为固定全屏工作台：顶部仅保留尺寸/进度，中间画布占满剩余高度，色板与主要操作固定在底部，不再依赖纵向滚动。</w:t>
+      </w:r>
+    </w:p>
+    <w:p>
+      <w:pPr>
+        <w:pStyle w:val="ListBullet"/>
+      </w:pPr>
+      <w:r>
+        <w:t>图纸采用高密度正方形色块，不再绘制圆豆；每五格显示强调线和坐标，放大到可读尺寸后在格内显示 A1、F14、G17 等色号。</w:t>
+      </w:r>
+    </w:p>
+    <w:p>
+      <w:pPr>
+        <w:pStyle w:val="ListBullet"/>
+      </w:pPr>
+      <w:r>
+        <w:t>新增本机图片导入：保持图片宽高比，根据 32、48、64、80、104 或 128 格精细度缩放取样，并量化到内置 30 色拼豆色板；透明像素保留为空格。</w:t>
+      </w:r>
+    </w:p>
+    <w:p>
+      <w:pPr>
+        <w:pStyle w:val="ListBullet"/>
+      </w:pPr>
+      <w:r>
+        <w:t>画布初始自动适屏；支持双指以触点中心缩放、单指拖动画布、鼠标滚轮缩放，以及加、减、适屏按钮。</w:t>
+      </w:r>
+    </w:p>
+    <w:p>
+      <w:pPr>
+        <w:pStyle w:val="ListBullet"/>
+      </w:pPr>
+      <w:r>
+        <w:t>继续保留双方每轮十格、错色不落子、角色只能复制锁定图纸正确颜色、模型失败不伪造台词和中断恢复。</w:t>
+      </w:r>
+    </w:p>
+    <w:p>
+      <w:pPr>
+        <w:pStyle w:val="ListBullet"/>
+      </w:pPr>
+      <w:r>
+        <w:t>本轮已在独立内置浏览器检查 32×32 适屏和放大色号状态；104×104 像素量化由自动测试覆盖。图片文件选择需由用户在试玩窗口实际选择后再验收。</w:t>
+      </w:r>
+    </w:p>
+    <w:p>
+      <w:pPr>
+        <w:pStyle w:val="Heading2"/>
+      </w:pPr>
+      <w:r>
+        <w:t>2026-09-05 像素拼拼乐试玩规则补充</w:t>
+      </w:r>
+    </w:p>
+    <w:p>
+      <w:pPr>
+        <w:pStyle w:val="ListBullet"/>
+      </w:pPr>
+      <w:r>
+        <w:rPr>
+          <w:rFonts w:ascii="Microsoft YaHei" w:hAnsi="Microsoft YaHei"/>
+          <w:sz w:val="21"/>
+        </w:rPr>
+        <w:t>游戏名称统一为“像素拼拼乐”，标题固定在游戏画面顶部正中间。</w:t>
+      </w:r>
+    </w:p>
+    <w:p>
+      <w:pPr>
+        <w:pStyle w:val="ListBullet"/>
+      </w:pPr>
+      <w:r>
+        <w:rPr>
+          <w:rFonts w:ascii="Microsoft YaHei" w:hAnsi="Microsoft YaHei"/>
+          <w:sz w:val="21"/>
+        </w:rPr>
+        <w:t>每轮双方默认各填 10 格；每幅作品可自由设为 1–100 格，双方使用同一个当前轮流格数。</w:t>
+      </w:r>
+    </w:p>
+    <w:p>
+      <w:pPr>
+        <w:pStyle w:val="ListBullet"/>
+      </w:pPr>
+      <w:r>
+        <w:rPr>
+          <w:rFonts w:ascii="Microsoft YaHei" w:hAnsi="Microsoft YaHei"/>
+          <w:sz w:val="21"/>
+        </w:rPr>
+        <w:t>导入图片后保留原图比例并量化为高密度方格；未填区域浅显、已填区域加深，只显示该图实际用到的横向滑动色板。</w:t>
+      </w:r>
+    </w:p>
+    <w:p>
+      <w:pPr>
+        <w:pStyle w:val="ListBullet"/>
+      </w:pPr>
+      <w:r>
+        <w:rPr>
+          <w:rFonts w:ascii="Microsoft YaHei" w:hAnsi="Microsoft YaHei"/>
+          <w:sz w:val="21"/>
+        </w:rPr>
+        <w:t>画布支持局部缩放与单指平移，并限制边界，避免整个画布被移出可视框。</w:t>
+      </w:r>
+    </w:p>
+    <w:p>
+      <w:pPr>
+        <w:pStyle w:val="ListBullet"/>
+      </w:pPr>
+      <w:r>
+        <w:rPr>
+          <w:rFonts w:ascii="Microsoft YaHei" w:hAnsi="Microsoft YaHei"/>
+          <w:sz w:val="21"/>
+        </w:rPr>
+        <w:t>未完成作品可保存退出并从大厅续拼；全部填满后由用户命名归档，再通过现有模型回复链路触发角色微信消息，不伪造失败回复。</w:t>
+      </w:r>
+    </w:p>
+    <w:p>
+      <w:pPr>
+        <w:pStyle w:val="ListBullet"/>
+      </w:pPr>
+      <w:r>
+        <w:rPr>
+          <w:rFonts w:ascii="Microsoft YaHei" w:hAnsi="Microsoft YaHei"/>
+          <w:sz w:val="21"/>
+        </w:rPr>
+        <w:t>本阶段仅为本地试玩框架，不提升正式版本号，不打包、不提交、不推送。</w:t>
+      </w:r>
+    </w:p>
+    <w:p>
+      <w:pPr>
+        <w:pStyle w:val="ListBullet"/>
+      </w:pPr>
+      <w:r>
+        <w:t>上传图识别范围：默认“仅主体”，排除与画布边缘连通的背景；空白格可在锁定前自由补色。用户切换“主体＋背景”时，才恢复整张矩形画布的量化色号并纳入完成度。</w:t>
+      </w:r>
+    </w:p>
+    <w:p>
+      <w:pPr>
+        <w:pStyle w:val="ListBullet"/>
+      </w:pPr>
+      <w:r>
+        <w:t>角色安全落格：模型不接触坐标和序号；程序只从锁定图纸的正确未填格中选择并复制目标色。即使启用“主体＋背景”，也会先完成主体，主体结束后才进入背景区域。</w:t>
+      </w:r>
+    </w:p>
+    <w:p>
+      <w:pPr>
+        <w:pStyle w:val="ListBullet"/>
+      </w:pPr>
+      <w:r>
+        <w:t>本地机器人回合：普通轮流填格完全由本地确定性算法执行，不调用模型，也不让模型选择坐标或色号；仅在作品完成并命名后，按既定需求通过现有回复链路生成一条角色微信消息。</w:t>
+      </w:r>
+    </w:p>
+    <w:p>
+      <w:pPr>
+        <w:pStyle w:val="ListBullet"/>
+      </w:pPr>
+      <w:r>
+        <w:t>本地预览支持模拟玩家与自动机器人连续轮流补位，并提供暂停／继续按钮，用于观察回合顺序、所有权描边与完成进度。</w:t>
       </w:r>
     </w:p>
     <w:sectPr>

</xml_diff>

<commit_message>
feat: add private HomeKit air conditioner controls
</commit_message>
<xml_diff>
--- a/docs/maintenance/AI开发项目_项目说明文档.docx
+++ b/docs/maintenance/AI开发项目_项目说明文档.docx
@@ -12385,6 +12385,34 @@
     <w:p>
       <w:r>
         <w:t>本次私人仍为Mac待编译源码，不是IPA，尚未Mac编译签名或真实iPhone验收。Word仅追加并保留历史，环境无soffice，视觉渲染未完成。</w:t>
+      </w:r>
+    </w:p>
+    <w:p>
+      <w:pPr>
+        <w:pStyle w:val="Heading2"/>
+      </w:pPr>
+      <w:r>
+        <w:t>2026年9月9日 私人版独立空调与角色自主关怀控制</w:t>
+      </w:r>
+    </w:p>
+    <w:p>
+      <w:r>
+        <w:t>范围：仅私人版新增第三个独立智能家居页面“空调”；卧室小灯、智能门锁和公开网页保持原样。设备依据用户在 Apple 家庭中已成功添加并可控制的配件接入，页面名称可由用户单独修改。</w:t>
+      </w:r>
+    </w:p>
+    <w:p>
+      <w:r>
+        <w:t>原生 HomeKit 桥接同时识别 Heater/Cooler 与 Thermostat 服务，读取并控制电源、模式和目标温度。风速不是根据商品宣传预设：只有真实配件暴露可写且可回读的 Rotation Speed 特征时才显示并允许操作。每次写入都必须通过新鲜状态回读验证，未匹配时不得向用户声称成功。</w:t>
+      </w:r>
+    </w:p>
+    <w:p>
+      <w:r>
+        <w:t>角色既可执行用户明确提出的开关、温度、模式和风速指令，也可结合“好热”“好冷”、睡眠和舒适需求，按人设自主判断是否关心并调节。普通冷热文字本身不会绕过角色判断直接触发设备；内部动作标签不进入可见聊天，操作完成后的话由角色按人设生成，失败不使用固定成功话冒充角色。</w:t>
+      </w:r>
+    </w:p>
+    <w:p>
+      <w:r>
+        <w:t>版本：私人内置页 v1217，私人 iOS 1.0.342 (342)，原生桥37。Windows 全量1718项及网页/私人双入口核心聊天检查通过。页面截图来自真实组件和模拟状态，不是 iPhone 实机回读；Mac/Xcode 编译、签名、覆盖安装和真实空调功能仍待真机验收。</w:t>
       </w:r>
     </w:p>
     <w:sectPr>

</xml_diff>